<commit_message>
fixed my expriments and added things to do
</commit_message>
<xml_diff>
--- a/דוחות ניסוי שלי.docx
+++ b/דוחות ניסוי שלי.docx
@@ -590,7 +590,7 @@
     <w:p>
       <w:pPr>
         <w:rPr>
-          <w:rFonts w:ascii="Tahoma" w:hAnsi="Tahoma" w:cs="Tahoma" w:hint="cs"/>
+          <w:rFonts w:ascii="Tahoma" w:hAnsi="Tahoma" w:cs="Tahoma"/>
           <w:rtl/>
         </w:rPr>
       </w:pPr>
@@ -915,25 +915,83 @@
       </w:pPr>
       <w:r>
         <w:rPr>
-          <w:rFonts w:ascii="Tahoma" w:hAnsi="Tahoma" w:cs="Tahoma"/>
+          <w:rFonts w:ascii="Tahoma" w:hAnsi="Tahoma" w:cs="Tahoma" w:hint="cs"/>
           <w:noProof/>
           <w:sz w:val="24"/>
           <w:szCs w:val="24"/>
           <w:rtl/>
         </w:rPr>
         <w:lastRenderedPageBreak/>
+        <w:t>סימולציה ב</w:t>
+      </w:r>
+      <w:r>
+        <w:rPr>
+          <w:rFonts w:ascii="Tahoma" w:hAnsi="Tahoma" w:cs="Tahoma" w:hint="cs"/>
+          <w:noProof/>
+          <w:sz w:val="24"/>
+          <w:szCs w:val="24"/>
+        </w:rPr>
+        <w:t>WOKWI</w:t>
+      </w:r>
+      <w:r>
+        <w:rPr>
+          <w:rFonts w:ascii="Tahoma" w:hAnsi="Tahoma" w:cs="Tahoma"/>
+          <w:sz w:val="28"/>
+          <w:szCs w:val="28"/>
+          <w:rtl/>
+        </w:rPr>
+        <w:t xml:space="preserve"> :</w:t>
+      </w:r>
+    </w:p>
+    <w:p>
+      <w:pPr>
+        <w:rPr>
+          <w:rFonts w:ascii="Tahoma" w:hAnsi="Tahoma" w:cs="Tahoma"/>
+          <w:rtl/>
+        </w:rPr>
+      </w:pPr>
+      <w:r>
+        <w:rPr>
+          <w:rFonts w:ascii="Tahoma" w:hAnsi="Tahoma" w:cs="Tahoma"/>
+        </w:rPr>
+        <w:t>https://wokwi.com/projects/409207281237974017</w:t>
+      </w:r>
+    </w:p>
+    <w:p>
+      <w:pPr>
+        <w:jc w:val="center"/>
+        <w:rPr>
+          <w:rtl/>
+        </w:rPr>
+      </w:pPr>
+      <w:r>
+        <w:rPr>
+          <w:rFonts w:ascii="Tahoma" w:hAnsi="Tahoma" w:cs="Tahoma"/>
+          <w:noProof/>
+          <w:sz w:val="24"/>
+          <w:szCs w:val="24"/>
+          <w:rtl/>
+        </w:rPr>
         <w:drawing>
-          <wp:anchor distT="0" distB="0" distL="114300" distR="114300" simplePos="0" relativeHeight="251659264" behindDoc="0" locked="0" layoutInCell="1" allowOverlap="1" wp14:anchorId="34D2157C" wp14:editId="7A8EFF66">
+          <wp:anchor distT="0" distB="0" distL="114300" distR="114300" simplePos="0" relativeHeight="251659264" behindDoc="1" locked="0" layoutInCell="1" allowOverlap="1" wp14:anchorId="34D2157C" wp14:editId="7A8EFF66">
             <wp:simplePos x="0" y="0"/>
             <wp:positionH relativeFrom="margin">
-              <wp:align>right</wp:align>
+              <wp:posOffset>3094453</wp:posOffset>
             </wp:positionH>
             <wp:positionV relativeFrom="paragraph">
-              <wp:posOffset>302260</wp:posOffset>
+              <wp:posOffset>8939</wp:posOffset>
             </wp:positionV>
             <wp:extent cx="2193925" cy="2755900"/>
             <wp:effectExtent l="0" t="0" r="0" b="6350"/>
-            <wp:wrapSquare wrapText="bothSides"/>
+            <wp:wrapTight wrapText="bothSides">
+              <wp:wrapPolygon edited="0">
+                <wp:start x="0" y="0"/>
+                <wp:lineTo x="0" y="21500"/>
+                <wp:lineTo x="21381" y="21500"/>
+                <wp:lineTo x="21381" y="0"/>
+                <wp:lineTo x="0" y="0"/>
+              </wp:wrapPolygon>
+            </wp:wrapTight>
             <wp:docPr id="2" name="תמונה 2"/>
             <wp:cNvGraphicFramePr>
               <a:graphicFrameLocks xmlns:a="http://schemas.openxmlformats.org/drawingml/2006/main" noChangeAspect="1"/>
@@ -978,42 +1036,6 @@
           </wp:anchor>
         </w:drawing>
       </w:r>
-      <w:r>
-        <w:rPr>
-          <w:rFonts w:ascii="Tahoma" w:hAnsi="Tahoma" w:cs="Tahoma" w:hint="cs"/>
-          <w:noProof/>
-          <w:sz w:val="24"/>
-          <w:szCs w:val="24"/>
-          <w:rtl/>
-        </w:rPr>
-        <w:t>סימולציה ב</w:t>
-      </w:r>
-      <w:r>
-        <w:rPr>
-          <w:rFonts w:ascii="Tahoma" w:hAnsi="Tahoma" w:cs="Tahoma" w:hint="cs"/>
-          <w:noProof/>
-          <w:sz w:val="24"/>
-          <w:szCs w:val="24"/>
-        </w:rPr>
-        <w:t>WOKWI</w:t>
-      </w:r>
-      <w:r>
-        <w:rPr>
-          <w:rFonts w:ascii="Tahoma" w:hAnsi="Tahoma" w:cs="Tahoma"/>
-          <w:sz w:val="28"/>
-          <w:szCs w:val="28"/>
-          <w:rtl/>
-        </w:rPr>
-        <w:t xml:space="preserve"> :</w:t>
-      </w:r>
-    </w:p>
-    <w:p>
-      <w:pPr>
-        <w:jc w:val="center"/>
-        <w:rPr>
-          <w:rtl/>
-        </w:rPr>
-      </w:pPr>
     </w:p>
     <w:p>
       <w:pPr>
@@ -2971,6 +2993,7 @@
           <w:sz w:val="20"/>
           <w:szCs w:val="20"/>
         </w:rPr>
+        <w:lastRenderedPageBreak/>
         <w:t xml:space="preserve">  </w:t>
       </w:r>
       <w:proofErr w:type="spellStart"/>
@@ -3062,7 +3085,6 @@
           <w:sz w:val="20"/>
           <w:szCs w:val="20"/>
         </w:rPr>
-        <w:lastRenderedPageBreak/>
         <w:t xml:space="preserve">  </w:t>
       </w:r>
     </w:p>
@@ -3694,7 +3716,7 @@
     <w:p>
       <w:pPr>
         <w:rPr>
-          <w:rFonts w:ascii="Tahoma" w:hAnsi="Tahoma" w:cs="Tahoma" w:hint="cs"/>
+          <w:rFonts w:ascii="Tahoma" w:hAnsi="Tahoma" w:cs="Tahoma"/>
           <w:sz w:val="28"/>
           <w:szCs w:val="28"/>
           <w:rtl/>
@@ -3913,7 +3935,7 @@
           </mc:Choice>
           <mc:Fallback>
             <w:pict>
-              <v:shapetype w14:anchorId="410CD315" id="_x0000_t67" coordsize="21600,21600" o:spt="67" adj="16200,5400" path="m0@0l@1@0@1,0@2,0@2@0,21600@0,10800,21600xe">
+              <v:shapetype w14:anchorId="50320DC6" id="_x0000_t67" coordsize="21600,21600" o:spt="67" adj="16200,5400" path="m0@0l@1@0@1,0@2,0@2@0,21600@0,10800,21600xe">
                 <v:stroke joinstyle="miter"/>
                 <v:formulas>
                   <v:f eqn="val #0"/>
@@ -4013,7 +4035,7 @@
           </mc:Choice>
           <mc:Fallback>
             <w:pict>
-              <v:shape w14:anchorId="2367DC20" id="חץ: למטה 1" o:spid="_x0000_s1026" type="#_x0000_t67" style="position:absolute;left:0;text-align:left;margin-left:87.8pt;margin-top:3.85pt;width:139pt;height:112.5pt;z-index:251660288;visibility:visible;mso-wrap-style:square;mso-height-percent:0;mso-wrap-distance-left:9pt;mso-wrap-distance-top:0;mso-wrap-distance-right:9pt;mso-wrap-distance-bottom:0;mso-position-horizontal:right;mso-position-horizontal-relative:margin;mso-position-vertical:absolute;mso-position-vertical-relative:text;mso-height-percent:0;mso-height-relative:margin;v-text-anchor:middle" o:gfxdata="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" adj="10800" fillcolor="#ffb9dc" strokecolor="#f9c" strokeweight="1.5pt">
+              <v:shape w14:anchorId="0043F647" id="חץ: למטה 1" o:spid="_x0000_s1026" type="#_x0000_t67" style="position:absolute;left:0;text-align:left;margin-left:87.8pt;margin-top:3.85pt;width:139pt;height:112.5pt;z-index:251660288;visibility:visible;mso-wrap-style:square;mso-height-percent:0;mso-wrap-distance-left:9pt;mso-wrap-distance-top:0;mso-wrap-distance-right:9pt;mso-wrap-distance-bottom:0;mso-position-horizontal:right;mso-position-horizontal-relative:margin;mso-position-vertical:absolute;mso-position-vertical-relative:text;mso-height-percent:0;mso-height-relative:margin;v-text-anchor:middle" o:gfxdata="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" adj="10800" fillcolor="#ffb9dc" strokecolor="#f9c" strokeweight="1.5pt">
                 <w10:wrap anchorx="margin"/>
               </v:shape>
             </w:pict>
@@ -4295,6 +4317,7 @@
       <w:r>
         <w:rPr>
           <w:rFonts w:ascii="Tahoma" w:hAnsi="Tahoma" w:cs="Tahoma"/>
+          <w:noProof/>
           <w:sz w:val="28"/>
           <w:szCs w:val="28"/>
           <w:rtl/>
@@ -4439,6 +4462,16 @@
       <w:pPr>
         <w:jc w:val="center"/>
         <w:rPr>
+          <w:rFonts w:ascii="Tahoma" w:hAnsi="Tahoma" w:cs="Tahoma"/>
+          <w:b/>
+          <w:bCs/>
+          <w:sz w:val="36"/>
+          <w:szCs w:val="36"/>
+          <w:rtl/>
+        </w:rPr>
+      </w:pPr>
+      <w:r>
+        <w:rPr>
           <w:rFonts w:ascii="Tahoma" w:hAnsi="Tahoma" w:cs="Tahoma" w:hint="cs"/>
           <w:b/>
           <w:bCs/>
@@ -4446,7 +4479,9 @@
           <w:szCs w:val="36"/>
           <w:rtl/>
         </w:rPr>
-      </w:pPr>
+        <w:lastRenderedPageBreak/>
+        <w:t xml:space="preserve">ניסוי </w:t>
+      </w:r>
       <w:r>
         <w:rPr>
           <w:rFonts w:ascii="Tahoma" w:hAnsi="Tahoma" w:cs="Tahoma" w:hint="cs"/>
@@ -4456,8 +4491,18 @@
           <w:szCs w:val="36"/>
           <w:rtl/>
         </w:rPr>
-        <w:lastRenderedPageBreak/>
-        <w:t xml:space="preserve">ניסוי </w:t>
+        <w:t xml:space="preserve">שני </w:t>
+      </w:r>
+      <w:r>
+        <w:rPr>
+          <w:rFonts w:ascii="Tahoma" w:hAnsi="Tahoma" w:cs="Tahoma"/>
+          <w:b/>
+          <w:bCs/>
+          <w:sz w:val="36"/>
+          <w:szCs w:val="36"/>
+          <w:rtl/>
+        </w:rPr>
+        <w:t>–</w:t>
       </w:r>
       <w:r>
         <w:rPr>
@@ -4468,18 +4513,7 @@
           <w:szCs w:val="36"/>
           <w:rtl/>
         </w:rPr>
-        <w:t xml:space="preserve">שני </w:t>
-      </w:r>
-      <w:r>
-        <w:rPr>
-          <w:rFonts w:ascii="Tahoma" w:hAnsi="Tahoma" w:cs="Tahoma"/>
-          <w:b/>
-          <w:bCs/>
-          <w:sz w:val="36"/>
-          <w:szCs w:val="36"/>
-          <w:rtl/>
-        </w:rPr>
-        <w:t>–</w:t>
+        <w:t xml:space="preserve"> </w:t>
       </w:r>
       <w:r>
         <w:rPr>
@@ -4490,7 +4524,7 @@
           <w:szCs w:val="36"/>
           <w:rtl/>
         </w:rPr>
-        <w:t xml:space="preserve"> </w:t>
+        <w:t>17</w:t>
       </w:r>
       <w:r>
         <w:rPr>
@@ -4501,17 +4535,6 @@
           <w:szCs w:val="36"/>
           <w:rtl/>
         </w:rPr>
-        <w:t>17</w:t>
-      </w:r>
-      <w:r>
-        <w:rPr>
-          <w:rFonts w:ascii="Tahoma" w:hAnsi="Tahoma" w:cs="Tahoma" w:hint="cs"/>
-          <w:b/>
-          <w:bCs/>
-          <w:sz w:val="36"/>
-          <w:szCs w:val="36"/>
-          <w:rtl/>
-        </w:rPr>
         <w:t>.9.24</w:t>
       </w:r>
     </w:p>
@@ -5348,6 +5371,24 @@
           <w:rtl/>
         </w:rPr>
         <w:t xml:space="preserve"> :</w:t>
+      </w:r>
+    </w:p>
+    <w:p>
+      <w:pPr>
+        <w:rPr>
+          <w:rFonts w:ascii="Tahoma" w:hAnsi="Tahoma" w:cs="Tahoma" w:hint="cs"/>
+          <w:sz w:val="20"/>
+          <w:szCs w:val="20"/>
+          <w:rtl/>
+        </w:rPr>
+      </w:pPr>
+      <w:r>
+        <w:rPr>
+          <w:rFonts w:ascii="Tahoma" w:hAnsi="Tahoma" w:cs="Tahoma"/>
+          <w:sz w:val="20"/>
+          <w:szCs w:val="20"/>
+        </w:rPr>
+        <w:t>https://wokwi.com/projects/409260495833051137</w:t>
       </w:r>
     </w:p>
     <w:p>
@@ -7332,6 +7373,7 @@
           <w:sz w:val="18"/>
           <w:szCs w:val="18"/>
         </w:rPr>
+        <w:lastRenderedPageBreak/>
         <w:t xml:space="preserve">    </w:t>
       </w:r>
       <w:r>
@@ -7363,7 +7405,6 @@
           <w:sz w:val="18"/>
           <w:szCs w:val="18"/>
         </w:rPr>
-        <w:lastRenderedPageBreak/>
         <w:t xml:space="preserve">    </w:t>
       </w:r>
       <w:proofErr w:type="spellStart"/>
@@ -8771,7 +8812,7 @@
     <w:p>
       <w:pPr>
         <w:rPr>
-          <w:rFonts w:ascii="Tahoma" w:hAnsi="Tahoma" w:cs="Tahoma" w:hint="cs"/>
+          <w:rFonts w:ascii="Tahoma" w:hAnsi="Tahoma" w:cs="Tahoma"/>
           <w:sz w:val="28"/>
           <w:szCs w:val="28"/>
           <w:rtl/>
@@ -8986,7 +9027,7 @@
           </mc:Choice>
           <mc:Fallback>
             <w:pict>
-              <v:shape w14:anchorId="704BFB97" id="חץ: למטה 11" o:spid="_x0000_s1026" type="#_x0000_t67" style="position:absolute;left:0;text-align:left;margin-left:0;margin-top:.35pt;width:139pt;height:112.5pt;z-index:251673600;visibility:visible;mso-wrap-style:square;mso-height-percent:0;mso-wrap-distance-left:9pt;mso-wrap-distance-top:0;mso-wrap-distance-right:9pt;mso-wrap-distance-bottom:0;mso-position-horizontal:left;mso-position-horizontal-relative:margin;mso-position-vertical:absolute;mso-position-vertical-relative:text;mso-height-percent:0;mso-height-relative:margin;v-text-anchor:middle" o:gfxdata="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" adj="10800" fillcolor="#ffb9dc" strokecolor="#f9c" strokeweight="1.5pt">
+              <v:shape w14:anchorId="57766392" id="חץ: למטה 11" o:spid="_x0000_s1026" type="#_x0000_t67" style="position:absolute;left:0;text-align:left;margin-left:0;margin-top:.35pt;width:139pt;height:112.5pt;z-index:251673600;visibility:visible;mso-wrap-style:square;mso-height-percent:0;mso-wrap-distance-left:9pt;mso-wrap-distance-top:0;mso-wrap-distance-right:9pt;mso-wrap-distance-bottom:0;mso-position-horizontal:left;mso-position-horizontal-relative:margin;mso-position-vertical:absolute;mso-position-vertical-relative:text;mso-height-percent:0;mso-height-relative:margin;v-text-anchor:middle" o:gfxdata="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" adj="10800" fillcolor="#ffb9dc" strokecolor="#f9c" strokeweight="1.5pt">
                 <w10:wrap anchorx="margin"/>
               </v:shape>
             </w:pict>
@@ -9070,7 +9111,7 @@
           </mc:Choice>
           <mc:Fallback>
             <w:pict>
-              <v:shape w14:anchorId="4A56FBFF" id="חץ: למטה 12" o:spid="_x0000_s1026" type="#_x0000_t67" style="position:absolute;left:0;text-align:left;margin-left:87.8pt;margin-top:3.85pt;width:139pt;height:112.5pt;z-index:251671552;visibility:visible;mso-wrap-style:square;mso-height-percent:0;mso-wrap-distance-left:9pt;mso-wrap-distance-top:0;mso-wrap-distance-right:9pt;mso-wrap-distance-bottom:0;mso-position-horizontal:right;mso-position-horizontal-relative:margin;mso-position-vertical:absolute;mso-position-vertical-relative:text;mso-height-percent:0;mso-height-relative:margin;v-text-anchor:middle" o:gfxdata="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" adj="10800" fillcolor="#ffb9dc" strokecolor="#f9c" strokeweight="1.5pt">
+              <v:shape w14:anchorId="2DA9B96B" id="חץ: למטה 12" o:spid="_x0000_s1026" type="#_x0000_t67" style="position:absolute;left:0;text-align:left;margin-left:87.8pt;margin-top:3.85pt;width:139pt;height:112.5pt;z-index:251671552;visibility:visible;mso-wrap-style:square;mso-height-percent:0;mso-wrap-distance-left:9pt;mso-wrap-distance-top:0;mso-wrap-distance-right:9pt;mso-wrap-distance-bottom:0;mso-position-horizontal:right;mso-position-horizontal-relative:margin;mso-position-vertical:absolute;mso-position-vertical-relative:text;mso-height-percent:0;mso-height-relative:margin;v-text-anchor:middle" o:gfxdata="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" adj="10800" fillcolor="#ffb9dc" strokecolor="#f9c" strokeweight="1.5pt">
                 <w10:wrap anchorx="margin"/>
               </v:shape>
             </w:pict>
@@ -9352,6 +9393,7 @@
       <w:r>
         <w:rPr>
           <w:rFonts w:ascii="Tahoma" w:hAnsi="Tahoma" w:cs="Tahoma"/>
+          <w:noProof/>
           <w:sz w:val="28"/>
           <w:szCs w:val="28"/>
           <w:rtl/>
@@ -9481,7 +9523,7 @@
     <w:p>
       <w:pPr>
         <w:rPr>
-          <w:rFonts w:ascii="Tahoma" w:hAnsi="Tahoma" w:cs="Tahoma" w:hint="cs"/>
+          <w:rFonts w:ascii="Tahoma" w:hAnsi="Tahoma" w:cs="Tahoma"/>
           <w:sz w:val="28"/>
           <w:szCs w:val="28"/>
           <w:rtl/>
@@ -9490,27 +9532,17 @@
     </w:p>
     <w:p>
       <w:pPr>
-        <w:bidi w:val="0"/>
-        <w:rPr>
-          <w:rFonts w:ascii="Tahoma" w:hAnsi="Tahoma" w:cs="Tahoma"/>
-          <w:sz w:val="28"/>
-          <w:szCs w:val="28"/>
-          <w:rtl/>
-        </w:rPr>
-      </w:pPr>
-      <w:r>
-        <w:rPr>
-          <w:rFonts w:ascii="Tahoma" w:hAnsi="Tahoma" w:cs="Tahoma"/>
-          <w:sz w:val="28"/>
-          <w:szCs w:val="28"/>
-          <w:rtl/>
-        </w:rPr>
-        <w:br w:type="page"/>
-      </w:r>
-    </w:p>
-    <w:p>
-      <w:pPr>
         <w:jc w:val="center"/>
+        <w:rPr>
+          <w:rFonts w:ascii="Tahoma" w:hAnsi="Tahoma" w:cs="Tahoma"/>
+          <w:b/>
+          <w:bCs/>
+          <w:sz w:val="36"/>
+          <w:szCs w:val="36"/>
+          <w:rtl/>
+        </w:rPr>
+      </w:pPr>
+      <w:r>
         <w:rPr>
           <w:rFonts w:ascii="Tahoma" w:hAnsi="Tahoma" w:cs="Tahoma" w:hint="cs"/>
           <w:b/>
@@ -9519,7 +9551,20 @@
           <w:szCs w:val="36"/>
           <w:rtl/>
         </w:rPr>
-      </w:pPr>
+        <w:lastRenderedPageBreak/>
+        <w:t xml:space="preserve">ניסוי שלישי </w:t>
+      </w:r>
+      <w:r>
+        <w:rPr>
+          <w:rFonts w:ascii="Tahoma" w:hAnsi="Tahoma" w:cs="Tahoma"/>
+          <w:b/>
+          <w:bCs/>
+          <w:sz w:val="36"/>
+          <w:szCs w:val="36"/>
+          <w:rtl/>
+        </w:rPr>
+        <w:t>–</w:t>
+      </w:r>
       <w:r>
         <w:rPr>
           <w:rFonts w:ascii="Tahoma" w:hAnsi="Tahoma" w:cs="Tahoma" w:hint="cs"/>
@@ -9529,29 +9574,6 @@
           <w:szCs w:val="36"/>
           <w:rtl/>
         </w:rPr>
-        <w:lastRenderedPageBreak/>
-        <w:t xml:space="preserve">ניסוי שלישי </w:t>
-      </w:r>
-      <w:r>
-        <w:rPr>
-          <w:rFonts w:ascii="Tahoma" w:hAnsi="Tahoma" w:cs="Tahoma"/>
-          <w:b/>
-          <w:bCs/>
-          <w:sz w:val="36"/>
-          <w:szCs w:val="36"/>
-          <w:rtl/>
-        </w:rPr>
-        <w:t>–</w:t>
-      </w:r>
-      <w:r>
-        <w:rPr>
-          <w:rFonts w:ascii="Tahoma" w:hAnsi="Tahoma" w:cs="Tahoma" w:hint="cs"/>
-          <w:b/>
-          <w:bCs/>
-          <w:sz w:val="36"/>
-          <w:szCs w:val="36"/>
-          <w:rtl/>
-        </w:rPr>
         <w:t xml:space="preserve"> 22.9.24</w:t>
       </w:r>
     </w:p>
@@ -9694,7 +9716,7 @@
     <w:p>
       <w:pPr>
         <w:rPr>
-          <w:rFonts w:ascii="Tahoma" w:hAnsi="Tahoma" w:cs="Tahoma" w:hint="cs"/>
+          <w:rFonts w:ascii="Tahoma" w:hAnsi="Tahoma" w:cs="Tahoma"/>
           <w:rtl/>
         </w:rPr>
       </w:pPr>
@@ -10573,6 +10595,41 @@
           <w:rFonts w:ascii="Tahoma" w:hAnsi="Tahoma" w:cs="Tahoma"/>
           <w:sz w:val="28"/>
           <w:szCs w:val="28"/>
+          <w:rtl/>
+        </w:rPr>
+      </w:pPr>
+      <w:r>
+        <w:rPr>
+          <w:rFonts w:ascii="Tahoma" w:hAnsi="Tahoma" w:cs="Tahoma" w:hint="cs"/>
+          <w:noProof/>
+          <w:sz w:val="24"/>
+          <w:szCs w:val="24"/>
+          <w:rtl/>
+        </w:rPr>
+        <w:t>סימולציה ב</w:t>
+      </w:r>
+      <w:r>
+        <w:rPr>
+          <w:rFonts w:ascii="Tahoma" w:hAnsi="Tahoma" w:cs="Tahoma" w:hint="cs"/>
+          <w:noProof/>
+          <w:sz w:val="24"/>
+          <w:szCs w:val="24"/>
+        </w:rPr>
+        <w:t>WOKWI</w:t>
+      </w:r>
+      <w:r>
+        <w:rPr>
+          <w:rFonts w:ascii="Tahoma" w:hAnsi="Tahoma" w:cs="Tahoma"/>
+          <w:sz w:val="28"/>
+          <w:szCs w:val="28"/>
+          <w:rtl/>
+        </w:rPr>
+        <w:t xml:space="preserve"> :</w:t>
+      </w:r>
+    </w:p>
+    <w:p>
+      <w:pPr>
+        <w:rPr>
           <w:rtl/>
         </w:rPr>
       </w:pPr>
@@ -10589,7 +10646,7 @@
               <wp:align>left</wp:align>
             </wp:positionH>
             <wp:positionV relativeFrom="paragraph">
-              <wp:posOffset>336599</wp:posOffset>
+              <wp:posOffset>206961</wp:posOffset>
             </wp:positionV>
             <wp:extent cx="5274945" cy="3306445"/>
             <wp:effectExtent l="0" t="0" r="1905" b="8255"/>
@@ -10639,41 +10696,8 @@
         </w:drawing>
       </w:r>
       <w:r>
-        <w:rPr>
-          <w:rFonts w:ascii="Tahoma" w:hAnsi="Tahoma" w:cs="Tahoma" w:hint="cs"/>
-          <w:noProof/>
-          <w:sz w:val="24"/>
-          <w:szCs w:val="24"/>
-          <w:rtl/>
-        </w:rPr>
-        <w:t>סימולציה ב</w:t>
-      </w:r>
-      <w:r>
-        <w:rPr>
-          <w:rFonts w:ascii="Tahoma" w:hAnsi="Tahoma" w:cs="Tahoma" w:hint="cs"/>
-          <w:noProof/>
-          <w:sz w:val="24"/>
-          <w:szCs w:val="24"/>
-        </w:rPr>
-        <w:t>WOKWI</w:t>
-      </w:r>
-      <w:r>
-        <w:rPr>
-          <w:rFonts w:ascii="Tahoma" w:hAnsi="Tahoma" w:cs="Tahoma"/>
-          <w:sz w:val="28"/>
-          <w:szCs w:val="28"/>
-          <w:rtl/>
-        </w:rPr>
-        <w:t xml:space="preserve"> :</w:t>
-      </w:r>
-    </w:p>
-    <w:p>
-      <w:pPr>
-        <w:jc w:val="center"/>
-        <w:rPr>
-          <w:rtl/>
-        </w:rPr>
-      </w:pPr>
+        <w:t>https://wokwi.com/projects/411109679902158849</w:t>
+      </w:r>
     </w:p>
     <w:p>
       <w:pPr>
@@ -13574,7 +13598,7 @@
     <w:p>
       <w:pPr>
         <w:rPr>
-          <w:rFonts w:ascii="Tahoma" w:hAnsi="Tahoma" w:cs="Tahoma" w:hint="cs"/>
+          <w:rFonts w:ascii="Tahoma" w:hAnsi="Tahoma" w:cs="Tahoma"/>
           <w:sz w:val="28"/>
           <w:szCs w:val="28"/>
           <w:rtl/>
@@ -13789,7 +13813,7 @@
           </mc:Choice>
           <mc:Fallback>
             <w:pict>
-              <v:shape w14:anchorId="008F31E0" id="חץ: למטה 22" o:spid="_x0000_s1026" type="#_x0000_t67" style="position:absolute;left:0;text-align:left;margin-left:0;margin-top:.35pt;width:139pt;height:112.5pt;z-index:251684864;visibility:visible;mso-wrap-style:square;mso-height-percent:0;mso-wrap-distance-left:9pt;mso-wrap-distance-top:0;mso-wrap-distance-right:9pt;mso-wrap-distance-bottom:0;mso-position-horizontal:left;mso-position-horizontal-relative:margin;mso-position-vertical:absolute;mso-position-vertical-relative:text;mso-height-percent:0;mso-height-relative:margin;v-text-anchor:middle" o:gfxdata="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" adj="10800" fillcolor="#ffb9dc" strokecolor="#f9c" strokeweight="1.5pt">
+              <v:shape w14:anchorId="0F739AB2" id="חץ: למטה 22" o:spid="_x0000_s1026" type="#_x0000_t67" style="position:absolute;left:0;text-align:left;margin-left:0;margin-top:.35pt;width:139pt;height:112.5pt;z-index:251684864;visibility:visible;mso-wrap-style:square;mso-height-percent:0;mso-wrap-distance-left:9pt;mso-wrap-distance-top:0;mso-wrap-distance-right:9pt;mso-wrap-distance-bottom:0;mso-position-horizontal:left;mso-position-horizontal-relative:margin;mso-position-vertical:absolute;mso-position-vertical-relative:text;mso-height-percent:0;mso-height-relative:margin;v-text-anchor:middle" o:gfxdata="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" adj="10800" fillcolor="#ffb9dc" strokecolor="#f9c" strokeweight="1.5pt">
                 <w10:wrap anchorx="margin"/>
               </v:shape>
             </w:pict>
@@ -13873,7 +13897,7 @@
           </mc:Choice>
           <mc:Fallback>
             <w:pict>
-              <v:shape w14:anchorId="6B28A4A2" id="חץ: למטה 23" o:spid="_x0000_s1026" type="#_x0000_t67" style="position:absolute;left:0;text-align:left;margin-left:87.8pt;margin-top:3.85pt;width:139pt;height:112.5pt;z-index:251682816;visibility:visible;mso-wrap-style:square;mso-height-percent:0;mso-wrap-distance-left:9pt;mso-wrap-distance-top:0;mso-wrap-distance-right:9pt;mso-wrap-distance-bottom:0;mso-position-horizontal:right;mso-position-horizontal-relative:margin;mso-position-vertical:absolute;mso-position-vertical-relative:text;mso-height-percent:0;mso-height-relative:margin;v-text-anchor:middle" o:gfxdata="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" adj="10800" fillcolor="#ffb9dc" strokecolor="#f9c" strokeweight="1.5pt">
+              <v:shape w14:anchorId="3A44EBE8" id="חץ: למטה 23" o:spid="_x0000_s1026" type="#_x0000_t67" style="position:absolute;left:0;text-align:left;margin-left:87.8pt;margin-top:3.85pt;width:139pt;height:112.5pt;z-index:251682816;visibility:visible;mso-wrap-style:square;mso-height-percent:0;mso-wrap-distance-left:9pt;mso-wrap-distance-top:0;mso-wrap-distance-right:9pt;mso-wrap-distance-bottom:0;mso-position-horizontal:right;mso-position-horizontal-relative:margin;mso-position-vertical:absolute;mso-position-vertical-relative:text;mso-height-percent:0;mso-height-relative:margin;v-text-anchor:middle" o:gfxdata="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" adj="10800" fillcolor="#ffb9dc" strokecolor="#f9c" strokeweight="1.5pt">
                 <w10:wrap anchorx="margin"/>
               </v:shape>
             </w:pict>
@@ -14155,6 +14179,7 @@
       <w:r>
         <w:rPr>
           <w:rFonts w:ascii="Tahoma" w:hAnsi="Tahoma" w:cs="Tahoma"/>
+          <w:noProof/>
           <w:sz w:val="28"/>
           <w:szCs w:val="28"/>
           <w:rtl/>
@@ -14288,7 +14313,7 @@
     <w:p>
       <w:pPr>
         <w:rPr>
-          <w:rFonts w:ascii="Tahoma" w:hAnsi="Tahoma" w:cs="Tahoma" w:hint="cs"/>
+          <w:rFonts w:ascii="Tahoma" w:hAnsi="Tahoma" w:cs="Tahoma"/>
           <w:sz w:val="28"/>
           <w:szCs w:val="28"/>
           <w:rtl/>
@@ -14317,6 +14342,16 @@
     <w:p>
       <w:pPr>
         <w:jc w:val="center"/>
+        <w:rPr>
+          <w:rFonts w:ascii="Tahoma" w:hAnsi="Tahoma" w:cs="Tahoma"/>
+          <w:b/>
+          <w:bCs/>
+          <w:sz w:val="36"/>
+          <w:szCs w:val="36"/>
+          <w:rtl/>
+        </w:rPr>
+      </w:pPr>
+      <w:r>
         <w:rPr>
           <w:rFonts w:ascii="Tahoma" w:hAnsi="Tahoma" w:cs="Tahoma" w:hint="cs"/>
           <w:b/>
@@ -14325,7 +14360,20 @@
           <w:szCs w:val="36"/>
           <w:rtl/>
         </w:rPr>
-      </w:pPr>
+        <w:lastRenderedPageBreak/>
+        <w:t xml:space="preserve">ניסוי רביעי </w:t>
+      </w:r>
+      <w:r>
+        <w:rPr>
+          <w:rFonts w:ascii="Tahoma" w:hAnsi="Tahoma" w:cs="Tahoma"/>
+          <w:b/>
+          <w:bCs/>
+          <w:sz w:val="36"/>
+          <w:szCs w:val="36"/>
+          <w:rtl/>
+        </w:rPr>
+        <w:t>–</w:t>
+      </w:r>
       <w:r>
         <w:rPr>
           <w:rFonts w:ascii="Tahoma" w:hAnsi="Tahoma" w:cs="Tahoma" w:hint="cs"/>
@@ -14335,19 +14383,7 @@
           <w:szCs w:val="36"/>
           <w:rtl/>
         </w:rPr>
-        <w:lastRenderedPageBreak/>
-        <w:t xml:space="preserve">ניסוי רביעי </w:t>
-      </w:r>
-      <w:r>
-        <w:rPr>
-          <w:rFonts w:ascii="Tahoma" w:hAnsi="Tahoma" w:cs="Tahoma"/>
-          <w:b/>
-          <w:bCs/>
-          <w:sz w:val="36"/>
-          <w:szCs w:val="36"/>
-          <w:rtl/>
-        </w:rPr>
-        <w:t>–</w:t>
+        <w:t xml:space="preserve"> </w:t>
       </w:r>
       <w:r>
         <w:rPr>
@@ -14358,7 +14394,7 @@
           <w:szCs w:val="36"/>
           <w:rtl/>
         </w:rPr>
-        <w:t xml:space="preserve"> </w:t>
+        <w:t>1</w:t>
       </w:r>
       <w:r>
         <w:rPr>
@@ -14369,7 +14405,7 @@
           <w:szCs w:val="36"/>
           <w:rtl/>
         </w:rPr>
-        <w:t>1</w:t>
+        <w:t>.</w:t>
       </w:r>
       <w:r>
         <w:rPr>
@@ -14380,7 +14416,7 @@
           <w:szCs w:val="36"/>
           <w:rtl/>
         </w:rPr>
-        <w:t>.</w:t>
+        <w:t>10</w:t>
       </w:r>
       <w:r>
         <w:rPr>
@@ -14391,17 +14427,6 @@
           <w:szCs w:val="36"/>
           <w:rtl/>
         </w:rPr>
-        <w:t>10</w:t>
-      </w:r>
-      <w:r>
-        <w:rPr>
-          <w:rFonts w:ascii="Tahoma" w:hAnsi="Tahoma" w:cs="Tahoma" w:hint="cs"/>
-          <w:b/>
-          <w:bCs/>
-          <w:sz w:val="36"/>
-          <w:szCs w:val="36"/>
-          <w:rtl/>
-        </w:rPr>
         <w:t>.24</w:t>
       </w:r>
     </w:p>
@@ -14468,7 +14493,7 @@
     <w:p>
       <w:pPr>
         <w:rPr>
-          <w:rFonts w:ascii="Tahoma" w:hAnsi="Tahoma" w:cs="Tahoma" w:hint="cs"/>
+          <w:rFonts w:ascii="Tahoma" w:hAnsi="Tahoma" w:cs="Tahoma"/>
           <w:rtl/>
         </w:rPr>
       </w:pPr>
@@ -15237,6 +15262,20 @@
     <w:p>
       <w:pPr>
         <w:rPr>
+          <w:rFonts w:ascii="Tahoma" w:hAnsi="Tahoma" w:cs="Tahoma" w:hint="cs"/>
+          <w:rtl/>
+        </w:rPr>
+      </w:pPr>
+      <w:r>
+        <w:rPr>
+          <w:rFonts w:ascii="Tahoma" w:hAnsi="Tahoma" w:cs="Tahoma"/>
+        </w:rPr>
+        <w:t>https://wokwi.com/projects/410521390609398785</w:t>
+      </w:r>
+    </w:p>
+    <w:p>
+      <w:pPr>
+        <w:rPr>
           <w:rtl/>
         </w:rPr>
       </w:pPr>
@@ -15250,8 +15289,8 @@
         </w:rPr>
         <w:drawing>
           <wp:inline distT="0" distB="0" distL="0" distR="0" wp14:anchorId="375D1DA4" wp14:editId="0A46F90B">
-            <wp:extent cx="4982174" cy="3528190"/>
-            <wp:effectExtent l="0" t="0" r="9525" b="0"/>
+            <wp:extent cx="4478876" cy="3171773"/>
+            <wp:effectExtent l="0" t="0" r="0" b="0"/>
             <wp:docPr id="4" name="תמונה 4"/>
             <wp:cNvGraphicFramePr>
               <a:graphicFrameLocks xmlns:a="http://schemas.openxmlformats.org/drawingml/2006/main" noChangeAspect="1"/>
@@ -15272,7 +15311,7 @@
                   <pic:spPr>
                     <a:xfrm>
                       <a:off x="0" y="0"/>
-                      <a:ext cx="5024405" cy="3558096"/>
+                      <a:ext cx="4570342" cy="3236546"/>
                     </a:xfrm>
                     <a:prstGeom prst="rect">
                       <a:avLst/>
@@ -15296,6 +15335,86 @@
       </w:pPr>
       <w:r>
         <w:rPr>
+          <w:rFonts w:ascii="Tahoma" w:hAnsi="Tahoma" w:cs="Tahoma" w:hint="cs"/>
+          <w:sz w:val="28"/>
+          <w:szCs w:val="28"/>
+          <w:rtl/>
+        </w:rPr>
+        <w:t>סימולציית גלים :</w:t>
+      </w:r>
+      <w:r>
+        <w:rPr>
+          <w:rFonts w:ascii="Tahoma" w:hAnsi="Tahoma" w:cs="Tahoma" w:hint="cs"/>
+          <w:sz w:val="28"/>
+          <w:szCs w:val="28"/>
+        </w:rPr>
+        <w:t xml:space="preserve"> </w:t>
+      </w:r>
+    </w:p>
+    <w:p>
+      <w:pPr>
+        <w:rPr>
+          <w:rFonts w:ascii="Tahoma" w:hAnsi="Tahoma" w:cs="Tahoma"/>
+          <w:sz w:val="28"/>
+          <w:szCs w:val="28"/>
+          <w:rtl/>
+        </w:rPr>
+      </w:pPr>
+      <w:r>
+        <w:rPr>
+          <w:rFonts w:ascii="Tahoma" w:hAnsi="Tahoma" w:cs="Tahoma"/>
+          <w:sz w:val="28"/>
+          <w:szCs w:val="28"/>
+          <w:rtl/>
+        </w:rPr>
+        <w:drawing>
+          <wp:inline distT="0" distB="0" distL="0" distR="0" wp14:anchorId="30938E18" wp14:editId="5D8ABAB9">
+            <wp:extent cx="6333607" cy="752621"/>
+            <wp:effectExtent l="0" t="0" r="0" b="9525"/>
+            <wp:docPr id="15" name="תמונה 15"/>
+            <wp:cNvGraphicFramePr>
+              <a:graphicFrameLocks xmlns:a="http://schemas.openxmlformats.org/drawingml/2006/main" noChangeAspect="1"/>
+            </wp:cNvGraphicFramePr>
+            <a:graphic xmlns:a="http://schemas.openxmlformats.org/drawingml/2006/main">
+              <a:graphicData uri="http://schemas.openxmlformats.org/drawingml/2006/picture">
+                <pic:pic xmlns:pic="http://schemas.openxmlformats.org/drawingml/2006/picture">
+                  <pic:nvPicPr>
+                    <pic:cNvPr id="1" name=""/>
+                    <pic:cNvPicPr/>
+                  </pic:nvPicPr>
+                  <pic:blipFill>
+                    <a:blip r:embed="rId17"/>
+                    <a:stretch>
+                      <a:fillRect/>
+                    </a:stretch>
+                  </pic:blipFill>
+                  <pic:spPr>
+                    <a:xfrm>
+                      <a:off x="0" y="0"/>
+                      <a:ext cx="6416902" cy="762519"/>
+                    </a:xfrm>
+                    <a:prstGeom prst="rect">
+                      <a:avLst/>
+                    </a:prstGeom>
+                  </pic:spPr>
+                </pic:pic>
+              </a:graphicData>
+            </a:graphic>
+          </wp:inline>
+        </w:drawing>
+      </w:r>
+    </w:p>
+    <w:p>
+      <w:pPr>
+        <w:rPr>
+          <w:rFonts w:ascii="Tahoma" w:hAnsi="Tahoma" w:cs="Tahoma"/>
+          <w:sz w:val="28"/>
+          <w:szCs w:val="28"/>
+          <w:rtl/>
+        </w:rPr>
+      </w:pPr>
+      <w:r>
+        <w:rPr>
           <w:rFonts w:ascii="Tahoma" w:hAnsi="Tahoma" w:cs="Tahoma"/>
           <w:sz w:val="28"/>
           <w:szCs w:val="28"/>
@@ -15317,6 +15436,7 @@
           <w:szCs w:val="21"/>
         </w:rPr>
       </w:pPr>
+      <w:bookmarkStart w:id="0" w:name="_GoBack"/>
       <w:r>
         <w:rPr>
           <w:rFonts w:ascii="Consolas" w:eastAsia="Times New Roman" w:hAnsi="Consolas" w:cs="Times New Roman"/>
@@ -15363,6 +15483,7 @@
         <w:t>&gt;</w:t>
       </w:r>
     </w:p>
+    <w:bookmarkEnd w:id="0"/>
     <w:p>
       <w:pPr>
         <w:shd w:val="clear" w:color="auto" w:fill="1E1E1E"/>
@@ -16262,6 +16383,7 @@
           <w:sz w:val="21"/>
           <w:szCs w:val="21"/>
         </w:rPr>
+        <w:lastRenderedPageBreak/>
         <w:t xml:space="preserve">  </w:t>
       </w:r>
       <w:r>
@@ -16593,14 +16715,13 @@
           <w:szCs w:val="28"/>
           <w:rtl/>
         </w:rPr>
-        <w:lastRenderedPageBreak/>
         <w:t>סרטונים :</w:t>
       </w:r>
     </w:p>
     <w:p>
       <w:pPr>
         <w:rPr>
-          <w:rFonts w:ascii="Tahoma" w:hAnsi="Tahoma" w:cs="Tahoma" w:hint="cs"/>
+          <w:rFonts w:ascii="Tahoma" w:hAnsi="Tahoma" w:cs="Tahoma"/>
           <w:sz w:val="28"/>
           <w:szCs w:val="28"/>
           <w:rtl/>
@@ -16815,7 +16936,7 @@
           </mc:Choice>
           <mc:Fallback>
             <w:pict>
-              <v:shape w14:anchorId="5C28A2BB" id="חץ: למטה 33" o:spid="_x0000_s1026" type="#_x0000_t67" style="position:absolute;left:0;text-align:left;margin-left:0;margin-top:.35pt;width:139pt;height:112.5pt;z-index:251699200;visibility:visible;mso-wrap-style:square;mso-height-percent:0;mso-wrap-distance-left:9pt;mso-wrap-distance-top:0;mso-wrap-distance-right:9pt;mso-wrap-distance-bottom:0;mso-position-horizontal:left;mso-position-horizontal-relative:margin;mso-position-vertical:absolute;mso-position-vertical-relative:text;mso-height-percent:0;mso-height-relative:margin;v-text-anchor:middle" o:gfxdata="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" adj="10800" fillcolor="#ffb9dc" strokecolor="#f9c" strokeweight="1.5pt">
+              <v:shape w14:anchorId="2305E600" id="חץ: למטה 33" o:spid="_x0000_s1026" type="#_x0000_t67" style="position:absolute;left:0;text-align:left;margin-left:0;margin-top:.35pt;width:139pt;height:112.5pt;z-index:251699200;visibility:visible;mso-wrap-style:square;mso-height-percent:0;mso-wrap-distance-left:9pt;mso-wrap-distance-top:0;mso-wrap-distance-right:9pt;mso-wrap-distance-bottom:0;mso-position-horizontal:left;mso-position-horizontal-relative:margin;mso-position-vertical:absolute;mso-position-vertical-relative:text;mso-height-percent:0;mso-height-relative:margin;v-text-anchor:middle" o:gfxdata="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" adj="10800" fillcolor="#ffb9dc" strokecolor="#f9c" strokeweight="1.5pt">
                 <w10:wrap anchorx="margin"/>
               </v:shape>
             </w:pict>
@@ -16899,7 +17020,7 @@
           </mc:Choice>
           <mc:Fallback>
             <w:pict>
-              <v:shape w14:anchorId="73485D3B" id="חץ: למטה 34" o:spid="_x0000_s1026" type="#_x0000_t67" style="position:absolute;left:0;text-align:left;margin-left:87.8pt;margin-top:3.85pt;width:139pt;height:112.5pt;z-index:251697152;visibility:visible;mso-wrap-style:square;mso-height-percent:0;mso-wrap-distance-left:9pt;mso-wrap-distance-top:0;mso-wrap-distance-right:9pt;mso-wrap-distance-bottom:0;mso-position-horizontal:right;mso-position-horizontal-relative:margin;mso-position-vertical:absolute;mso-position-vertical-relative:text;mso-height-percent:0;mso-height-relative:margin;v-text-anchor:middle" o:gfxdata="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" adj="10800" fillcolor="#ffb9dc" strokecolor="#f9c" strokeweight="1.5pt">
+              <v:shape w14:anchorId="53728EA5" id="חץ: למטה 34" o:spid="_x0000_s1026" type="#_x0000_t67" style="position:absolute;left:0;text-align:left;margin-left:87.8pt;margin-top:3.85pt;width:139pt;height:112.5pt;z-index:251697152;visibility:visible;mso-wrap-style:square;mso-height-percent:0;mso-wrap-distance-left:9pt;mso-wrap-distance-top:0;mso-wrap-distance-right:9pt;mso-wrap-distance-bottom:0;mso-position-horizontal:right;mso-position-horizontal-relative:margin;mso-position-vertical:absolute;mso-position-vertical-relative:text;mso-height-percent:0;mso-height-relative:margin;v-text-anchor:middle" o:gfxdata="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" adj="10800" fillcolor="#ffb9dc" strokecolor="#f9c" strokeweight="1.5pt">
                 <w10:wrap anchorx="margin"/>
               </v:shape>
             </w:pict>
@@ -17162,7 +17283,7 @@
     <w:p>
       <w:pPr>
         <w:rPr>
-          <w:rFonts w:ascii="Tahoma" w:hAnsi="Tahoma" w:cs="Tahoma" w:hint="cs"/>
+          <w:rFonts w:ascii="Tahoma" w:hAnsi="Tahoma" w:cs="Tahoma"/>
           <w:sz w:val="28"/>
           <w:szCs w:val="28"/>
           <w:rtl/>
@@ -17172,7 +17293,7 @@
     <w:p>
       <w:pPr>
         <w:rPr>
-          <w:rFonts w:ascii="Tahoma" w:hAnsi="Tahoma" w:cs="Tahoma" w:hint="cs"/>
+          <w:rFonts w:ascii="Tahoma" w:hAnsi="Tahoma" w:cs="Tahoma"/>
           <w:sz w:val="28"/>
           <w:szCs w:val="28"/>
           <w:rtl/>
@@ -17180,7 +17301,64 @@
       </w:pPr>
       <w:r>
         <w:rPr>
-          <w:rFonts w:ascii="Tahoma" w:hAnsi="Tahoma" w:cs="Tahoma"/>
+          <w:rFonts w:cs="Arial"/>
+          <w:noProof/>
+          <w:rtl/>
+        </w:rPr>
+        <w:drawing>
+          <wp:anchor distT="0" distB="0" distL="114300" distR="114300" simplePos="0" relativeHeight="251710464" behindDoc="0" locked="0" layoutInCell="1" allowOverlap="1" wp14:anchorId="6557537E">
+            <wp:simplePos x="0" y="0"/>
+            <wp:positionH relativeFrom="column">
+              <wp:posOffset>3309279</wp:posOffset>
+            </wp:positionH>
+            <wp:positionV relativeFrom="paragraph">
+              <wp:posOffset>162414</wp:posOffset>
+            </wp:positionV>
+            <wp:extent cx="2086266" cy="2715004"/>
+            <wp:effectExtent l="0" t="0" r="9525" b="9525"/>
+            <wp:wrapSquare wrapText="bothSides"/>
+            <wp:docPr id="17" name="תמונה 17"/>
+            <wp:cNvGraphicFramePr>
+              <a:graphicFrameLocks xmlns:a="http://schemas.openxmlformats.org/drawingml/2006/main" noChangeAspect="1"/>
+            </wp:cNvGraphicFramePr>
+            <a:graphic xmlns:a="http://schemas.openxmlformats.org/drawingml/2006/main">
+              <a:graphicData uri="http://schemas.openxmlformats.org/drawingml/2006/picture">
+                <pic:pic xmlns:pic="http://schemas.openxmlformats.org/drawingml/2006/picture">
+                  <pic:nvPicPr>
+                    <pic:cNvPr id="1" name=""/>
+                    <pic:cNvPicPr/>
+                  </pic:nvPicPr>
+                  <pic:blipFill>
+                    <a:blip r:embed="rId18">
+                      <a:extLst>
+                        <a:ext uri="{28A0092B-C50C-407E-A947-70E740481C1C}">
+                          <a14:useLocalDpi xmlns:a14="http://schemas.microsoft.com/office/drawing/2010/main" val="0"/>
+                        </a:ext>
+                      </a:extLst>
+                    </a:blip>
+                    <a:stretch>
+                      <a:fillRect/>
+                    </a:stretch>
+                  </pic:blipFill>
+                  <pic:spPr>
+                    <a:xfrm>
+                      <a:off x="0" y="0"/>
+                      <a:ext cx="2086266" cy="2715004"/>
+                    </a:xfrm>
+                    <a:prstGeom prst="rect">
+                      <a:avLst/>
+                    </a:prstGeom>
+                  </pic:spPr>
+                </pic:pic>
+              </a:graphicData>
+            </a:graphic>
+          </wp:anchor>
+        </w:drawing>
+      </w:r>
+      <w:r>
+        <w:rPr>
+          <w:rFonts w:ascii="Tahoma" w:hAnsi="Tahoma" w:cs="Tahoma"/>
+          <w:noProof/>
           <w:sz w:val="28"/>
           <w:szCs w:val="28"/>
           <w:rtl/>
@@ -17209,7 +17387,7 @@
                     <pic:cNvPicPr/>
                   </pic:nvPicPr>
                   <pic:blipFill>
-                    <a:blip r:embed="rId17">
+                    <a:blip r:embed="rId19">
                       <a:extLst>
                         <a:ext uri="{28A0092B-C50C-407E-A947-70E740481C1C}">
                           <a14:useLocalDpi xmlns:a14="http://schemas.microsoft.com/office/drawing/2010/main" val="0"/>
@@ -17251,7 +17429,7 @@
     <w:p>
       <w:pPr>
         <w:rPr>
-          <w:rFonts w:ascii="Tahoma" w:hAnsi="Tahoma" w:cs="Tahoma" w:hint="cs"/>
+          <w:rFonts w:ascii="Tahoma" w:hAnsi="Tahoma" w:cs="Tahoma"/>
           <w:sz w:val="28"/>
           <w:szCs w:val="28"/>
           <w:rtl/>
@@ -17261,6 +17439,25 @@
     <w:p>
       <w:pPr>
         <w:jc w:val="center"/>
+        <w:rPr>
+          <w:rFonts w:ascii="Tahoma" w:hAnsi="Tahoma" w:cs="Tahoma"/>
+          <w:b/>
+          <w:bCs/>
+          <w:sz w:val="36"/>
+          <w:szCs w:val="36"/>
+          <w:rtl/>
+        </w:rPr>
+      </w:pPr>
+      <w:r>
+        <w:rPr>
+          <w:rFonts w:ascii="Tahoma" w:hAnsi="Tahoma" w:cs="Tahoma"/>
+          <w:sz w:val="28"/>
+          <w:szCs w:val="28"/>
+          <w:rtl/>
+        </w:rPr>
+        <w:br w:type="page"/>
+      </w:r>
+      <w:r>
         <w:rPr>
           <w:rFonts w:ascii="Tahoma" w:hAnsi="Tahoma" w:cs="Tahoma" w:hint="cs"/>
           <w:b/>
@@ -17269,15 +17466,19 @@
           <w:szCs w:val="36"/>
           <w:rtl/>
         </w:rPr>
-      </w:pPr>
-      <w:r>
-        <w:rPr>
-          <w:rFonts w:ascii="Tahoma" w:hAnsi="Tahoma" w:cs="Tahoma"/>
-          <w:sz w:val="28"/>
-          <w:szCs w:val="28"/>
-          <w:rtl/>
-        </w:rPr>
-        <w:br w:type="page"/>
+        <w:lastRenderedPageBreak/>
+        <w:t xml:space="preserve">ניסוי חמישי </w:t>
+      </w:r>
+      <w:r>
+        <w:rPr>
+          <w:rFonts w:ascii="Tahoma" w:hAnsi="Tahoma" w:cs="Tahoma"/>
+          <w:b/>
+          <w:bCs/>
+          <w:sz w:val="36"/>
+          <w:szCs w:val="36"/>
+          <w:rtl/>
+        </w:rPr>
+        <w:t>–</w:t>
       </w:r>
       <w:r>
         <w:rPr>
@@ -17288,74 +17489,7 @@
           <w:szCs w:val="36"/>
           <w:rtl/>
         </w:rPr>
-        <w:lastRenderedPageBreak/>
-        <w:t xml:space="preserve">ניסוי </w:t>
-      </w:r>
-      <w:r>
-        <w:rPr>
-          <w:rFonts w:ascii="Tahoma" w:hAnsi="Tahoma" w:cs="Tahoma" w:hint="cs"/>
-          <w:b/>
-          <w:bCs/>
-          <w:sz w:val="36"/>
-          <w:szCs w:val="36"/>
-          <w:rtl/>
-        </w:rPr>
-        <w:t>חמישי</w:t>
-      </w:r>
-      <w:r>
-        <w:rPr>
-          <w:rFonts w:ascii="Tahoma" w:hAnsi="Tahoma" w:cs="Tahoma" w:hint="cs"/>
-          <w:b/>
-          <w:bCs/>
-          <w:sz w:val="36"/>
-          <w:szCs w:val="36"/>
-          <w:rtl/>
-        </w:rPr>
-        <w:t xml:space="preserve"> </w:t>
-      </w:r>
-      <w:r>
-        <w:rPr>
-          <w:rFonts w:ascii="Tahoma" w:hAnsi="Tahoma" w:cs="Tahoma"/>
-          <w:b/>
-          <w:bCs/>
-          <w:sz w:val="36"/>
-          <w:szCs w:val="36"/>
-          <w:rtl/>
-        </w:rPr>
-        <w:t>–</w:t>
-      </w:r>
-      <w:r>
-        <w:rPr>
-          <w:rFonts w:ascii="Tahoma" w:hAnsi="Tahoma" w:cs="Tahoma" w:hint="cs"/>
-          <w:b/>
-          <w:bCs/>
-          <w:sz w:val="36"/>
-          <w:szCs w:val="36"/>
-          <w:rtl/>
-        </w:rPr>
-        <w:t xml:space="preserve"> </w:t>
-      </w:r>
-      <w:r>
-        <w:rPr>
-          <w:rFonts w:ascii="Tahoma" w:hAnsi="Tahoma" w:cs="Tahoma" w:hint="cs"/>
-          <w:b/>
-          <w:bCs/>
-          <w:sz w:val="36"/>
-          <w:szCs w:val="36"/>
-          <w:rtl/>
-        </w:rPr>
-        <w:t>8</w:t>
-      </w:r>
-      <w:r>
-        <w:rPr>
-          <w:rFonts w:ascii="Tahoma" w:hAnsi="Tahoma" w:cs="Tahoma" w:hint="cs"/>
-          <w:b/>
-          <w:bCs/>
-          <w:sz w:val="36"/>
-          <w:szCs w:val="36"/>
-          <w:rtl/>
-        </w:rPr>
-        <w:t>.10.24</w:t>
+        <w:t xml:space="preserve"> 8.10.24</w:t>
       </w:r>
     </w:p>
     <w:p>
@@ -17441,7 +17575,7 @@
     <w:p>
       <w:pPr>
         <w:rPr>
-          <w:rFonts w:ascii="Tahoma" w:hAnsi="Tahoma" w:cs="Tahoma" w:hint="cs"/>
+          <w:rFonts w:ascii="Tahoma" w:hAnsi="Tahoma" w:cs="Tahoma"/>
           <w:rtl/>
         </w:rPr>
       </w:pPr>
@@ -17529,14 +17663,7 @@
           <w:rFonts w:ascii="Tahoma" w:hAnsi="Tahoma" w:cs="Tahoma" w:hint="cs"/>
           <w:rtl/>
         </w:rPr>
-        <w:t xml:space="preserve"> בצבע שונה. בחרתי באדום לזיהוי בטווח קצר וירוק לזיהוי בטווח ארוך</w:t>
-      </w:r>
-      <w:r>
-        <w:rPr>
-          <w:rFonts w:ascii="Tahoma" w:hAnsi="Tahoma" w:cs="Tahoma" w:hint="cs"/>
-          <w:rtl/>
-        </w:rPr>
-        <w:t xml:space="preserve">. לעשות זאת </w:t>
+        <w:t xml:space="preserve"> בצבע שונה. בחרתי באדום לזיהוי בטווח קצר וירוק לזיהוי בטווח ארוך. לעשות זאת </w:t>
       </w:r>
       <w:r>
         <w:rPr>
@@ -18113,64 +18240,36 @@
           <w:rFonts w:ascii="Tahoma" w:hAnsi="Tahoma" w:cs="Tahoma" w:hint="cs"/>
           <w:rtl/>
         </w:rPr>
-        <w:t xml:space="preserve"> שהניסוי פועל לפי הדרישות ושאם </w:t>
-      </w:r>
+        <w:t xml:space="preserve"> שהניסוי פועל לפי הדרישות ושאם נקלט אובייקט בטווח של 10 </w:t>
+      </w:r>
+      <w:proofErr w:type="spellStart"/>
       <w:r>
         <w:rPr>
           <w:rFonts w:ascii="Tahoma" w:hAnsi="Tahoma" w:cs="Tahoma" w:hint="cs"/>
           <w:rtl/>
         </w:rPr>
-        <w:t xml:space="preserve">נקלט אובייקט בטווח של 10 </w:t>
-      </w:r>
-      <w:proofErr w:type="spellStart"/>
+        <w:t>סמ</w:t>
+      </w:r>
+      <w:proofErr w:type="spellEnd"/>
       <w:r>
         <w:rPr>
           <w:rFonts w:ascii="Tahoma" w:hAnsi="Tahoma" w:cs="Tahoma" w:hint="cs"/>
           <w:rtl/>
         </w:rPr>
-        <w:t>סמ</w:t>
-      </w:r>
-      <w:proofErr w:type="spellEnd"/>
+        <w:t xml:space="preserve"> ומטה הודלק </w:t>
+      </w:r>
       <w:r>
         <w:rPr>
           <w:rFonts w:ascii="Tahoma" w:hAnsi="Tahoma" w:cs="Tahoma" w:hint="cs"/>
-          <w:rtl/>
-        </w:rPr>
-        <w:t xml:space="preserve"> ומטה </w:t>
+        </w:rPr>
+        <w:t>RGB</w:t>
       </w:r>
       <w:r>
         <w:rPr>
           <w:rFonts w:ascii="Tahoma" w:hAnsi="Tahoma" w:cs="Tahoma" w:hint="cs"/>
           <w:rtl/>
         </w:rPr>
-        <w:t xml:space="preserve">הודלק </w:t>
-      </w:r>
-      <w:r>
-        <w:rPr>
-          <w:rFonts w:ascii="Tahoma" w:hAnsi="Tahoma" w:cs="Tahoma" w:hint="cs"/>
-        </w:rPr>
-        <w:t>RGB</w:t>
-      </w:r>
-      <w:r>
-        <w:rPr>
-          <w:rFonts w:ascii="Tahoma" w:hAnsi="Tahoma" w:cs="Tahoma" w:hint="cs"/>
-          <w:rtl/>
-        </w:rPr>
-        <w:t xml:space="preserve"> בצבע אדום, אחרת</w:t>
-      </w:r>
-      <w:r>
-        <w:rPr>
-          <w:rFonts w:ascii="Tahoma" w:hAnsi="Tahoma" w:cs="Tahoma" w:hint="cs"/>
-          <w:rtl/>
-        </w:rPr>
-        <w:t xml:space="preserve"> הודלק בצבע</w:t>
-      </w:r>
-      <w:r>
-        <w:rPr>
-          <w:rFonts w:ascii="Tahoma" w:hAnsi="Tahoma" w:cs="Tahoma" w:hint="cs"/>
-          <w:rtl/>
-        </w:rPr>
-        <w:t xml:space="preserve"> ירוק</w:t>
+        <w:t xml:space="preserve"> בצבע אדום, אחרת הודלק בצבע ירוק</w:t>
       </w:r>
       <w:r>
         <w:rPr>
@@ -18472,6 +18571,7 @@
       <w:r>
         <w:rPr>
           <w:rFonts w:cs="Arial"/>
+          <w:noProof/>
           <w:rtl/>
         </w:rPr>
         <w:drawing>
@@ -18490,7 +18590,7 @@
                     <pic:cNvPicPr/>
                   </pic:nvPicPr>
                   <pic:blipFill>
-                    <a:blip r:embed="rId18"/>
+                    <a:blip r:embed="rId20"/>
                     <a:stretch>
                       <a:fillRect/>
                     </a:stretch>
@@ -22044,7 +22144,7 @@
     <w:p>
       <w:pPr>
         <w:rPr>
-          <w:rFonts w:ascii="Tahoma" w:hAnsi="Tahoma" w:cs="Tahoma" w:hint="cs"/>
+          <w:rFonts w:ascii="Tahoma" w:hAnsi="Tahoma" w:cs="Tahoma"/>
           <w:sz w:val="28"/>
           <w:szCs w:val="28"/>
           <w:rtl/>
@@ -22259,7 +22359,7 @@
           </mc:Choice>
           <mc:Fallback>
             <w:pict>
-              <v:shape w14:anchorId="272EF1DE" id="חץ: למטה 50" o:spid="_x0000_s1026" type="#_x0000_t67" style="position:absolute;left:0;text-align:left;margin-left:0;margin-top:.35pt;width:139pt;height:112.5pt;z-index:251706368;visibility:visible;mso-wrap-style:square;mso-height-percent:0;mso-wrap-distance-left:9pt;mso-wrap-distance-top:0;mso-wrap-distance-right:9pt;mso-wrap-distance-bottom:0;mso-position-horizontal:left;mso-position-horizontal-relative:margin;mso-position-vertical:absolute;mso-position-vertical-relative:text;mso-height-percent:0;mso-height-relative:margin;v-text-anchor:middle" o:gfxdata="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" adj="10800" fillcolor="#ffb9dc" strokecolor="#f9c" strokeweight="1.5pt">
+              <v:shape w14:anchorId="55F5A659" id="חץ: למטה 50" o:spid="_x0000_s1026" type="#_x0000_t67" style="position:absolute;left:0;text-align:left;margin-left:0;margin-top:.35pt;width:139pt;height:112.5pt;z-index:251706368;visibility:visible;mso-wrap-style:square;mso-height-percent:0;mso-wrap-distance-left:9pt;mso-wrap-distance-top:0;mso-wrap-distance-right:9pt;mso-wrap-distance-bottom:0;mso-position-horizontal:left;mso-position-horizontal-relative:margin;mso-position-vertical:absolute;mso-position-vertical-relative:text;mso-height-percent:0;mso-height-relative:margin;v-text-anchor:middle" o:gfxdata="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" adj="10800" fillcolor="#ffb9dc" strokecolor="#f9c" strokeweight="1.5pt">
                 <w10:wrap anchorx="margin"/>
               </v:shape>
             </w:pict>
@@ -22343,7 +22443,7 @@
           </mc:Choice>
           <mc:Fallback>
             <w:pict>
-              <v:shape w14:anchorId="02B1607E" id="חץ: למטה 51" o:spid="_x0000_s1026" type="#_x0000_t67" style="position:absolute;left:0;text-align:left;margin-left:87.8pt;margin-top:3.85pt;width:139pt;height:112.5pt;z-index:251704320;visibility:visible;mso-wrap-style:square;mso-height-percent:0;mso-wrap-distance-left:9pt;mso-wrap-distance-top:0;mso-wrap-distance-right:9pt;mso-wrap-distance-bottom:0;mso-position-horizontal:right;mso-position-horizontal-relative:margin;mso-position-vertical:absolute;mso-position-vertical-relative:text;mso-height-percent:0;mso-height-relative:margin;v-text-anchor:middle" o:gfxdata="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" adj="10800" fillcolor="#ffb9dc" strokecolor="#f9c" strokeweight="1.5pt">
+              <v:shape w14:anchorId="784793F7" id="חץ: למטה 51" o:spid="_x0000_s1026" type="#_x0000_t67" style="position:absolute;left:0;text-align:left;margin-left:87.8pt;margin-top:3.85pt;width:139pt;height:112.5pt;z-index:251704320;visibility:visible;mso-wrap-style:square;mso-height-percent:0;mso-wrap-distance-left:9pt;mso-wrap-distance-top:0;mso-wrap-distance-right:9pt;mso-wrap-distance-bottom:0;mso-position-horizontal:right;mso-position-horizontal-relative:margin;mso-position-vertical:absolute;mso-position-vertical-relative:text;mso-height-percent:0;mso-height-relative:margin;v-text-anchor:middle" o:gfxdata="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" adj="10800" fillcolor="#ffb9dc" strokecolor="#f9c" strokeweight="1.5pt">
                 <w10:wrap anchorx="margin"/>
               </v:shape>
             </w:pict>
@@ -22606,7 +22706,7 @@
     <w:p>
       <w:pPr>
         <w:rPr>
-          <w:rFonts w:ascii="Tahoma" w:hAnsi="Tahoma" w:cs="Tahoma" w:hint="cs"/>
+          <w:rFonts w:ascii="Tahoma" w:hAnsi="Tahoma" w:cs="Tahoma"/>
           <w:sz w:val="28"/>
           <w:szCs w:val="28"/>
           <w:rtl/>
@@ -22616,7 +22716,7 @@
     <w:p>
       <w:pPr>
         <w:rPr>
-          <w:rFonts w:ascii="Tahoma" w:hAnsi="Tahoma" w:cs="Tahoma" w:hint="cs"/>
+          <w:rFonts w:ascii="Tahoma" w:hAnsi="Tahoma" w:cs="Tahoma"/>
           <w:sz w:val="28"/>
           <w:szCs w:val="28"/>
           <w:rtl/>
@@ -22625,6 +22725,7 @@
       <w:r>
         <w:rPr>
           <w:rFonts w:ascii="Tahoma" w:hAnsi="Tahoma" w:cs="Tahoma"/>
+          <w:noProof/>
           <w:sz w:val="28"/>
           <w:szCs w:val="28"/>
           <w:rtl/>
@@ -22653,7 +22754,7 @@
                     <pic:cNvPicPr/>
                   </pic:nvPicPr>
                   <pic:blipFill>
-                    <a:blip r:embed="rId19">
+                    <a:blip r:embed="rId21">
                       <a:extLst>
                         <a:ext uri="{28A0092B-C50C-407E-A947-70E740481C1C}">
                           <a14:useLocalDpi xmlns:a14="http://schemas.microsoft.com/office/drawing/2010/main" val="0"/>
@@ -22695,7 +22796,7 @@
     <w:p>
       <w:pPr>
         <w:rPr>
-          <w:rFonts w:ascii="Tahoma" w:hAnsi="Tahoma" w:cs="Tahoma" w:hint="cs"/>
+          <w:rFonts w:ascii="Tahoma" w:hAnsi="Tahoma" w:cs="Tahoma"/>
           <w:sz w:val="28"/>
           <w:szCs w:val="28"/>
           <w:rtl/>
@@ -22705,7 +22806,7 @@
     <w:p>
       <w:pPr>
         <w:rPr>
-          <w:rFonts w:ascii="Tahoma" w:hAnsi="Tahoma" w:cs="Tahoma" w:hint="cs"/>
+          <w:rFonts w:ascii="Tahoma" w:hAnsi="Tahoma" w:cs="Tahoma"/>
           <w:sz w:val="28"/>
           <w:szCs w:val="28"/>
           <w:rtl/>
@@ -22720,16 +22821,13 @@
         </w:rPr>
         <w:br w:type="page"/>
       </w:r>
-      <w:bookmarkStart w:id="0" w:name="_GoBack"/>
-      <w:bookmarkEnd w:id="0"/>
-    </w:p>
-    <w:p>
-      <w:pPr>
-        <w:rPr>
-          <w:rFonts w:ascii="Tahoma" w:hAnsi="Tahoma" w:cs="Tahoma" w:hint="cs"/>
+    </w:p>
+    <w:p>
+      <w:pPr>
+        <w:rPr>
+          <w:rFonts w:ascii="Tahoma" w:hAnsi="Tahoma" w:cs="Tahoma"/>
           <w:sz w:val="28"/>
           <w:szCs w:val="28"/>
-          <w:rtl/>
         </w:rPr>
       </w:pPr>
     </w:p>
@@ -23477,7 +23575,7 @@
 </file>
 
 <file path=customXml/itemProps1.xml><?xml version="1.0" encoding="utf-8"?>
-<ds:datastoreItem xmlns:ds="http://schemas.openxmlformats.org/officeDocument/2006/customXml" ds:itemID="{108BE173-EDCC-4E53-835A-CE6735A07C30}">
+<ds:datastoreItem xmlns:ds="http://schemas.openxmlformats.org/officeDocument/2006/customXml" ds:itemID="{E21671CA-753B-44C3-9362-1D2BD4188E68}">
   <ds:schemaRefs>
     <ds:schemaRef ds:uri="http://schemas.openxmlformats.org/officeDocument/2006/bibliography"/>
   </ds:schemaRefs>

</xml_diff>